<commit_message>
Fix underline in preview, update vite config for network access
</commit_message>
<xml_diff>
--- a/backend/uploads/4/e330ae35f65146f3b4f72666743cef83.docx
+++ b/backend/uploads/4/e330ae35f65146f3b4f72666743cef83.docx
@@ -184,6 +184,61 @@
       <w:r>
         <w:rPr>
           <w:rFonts w:ascii="Calibri" w:hAnsi="Calibri"/>
+          <w:b/>
+          <w:i/>
+          <w:color w:val="FF0000"/>
+          <w:sz w:val="58"/>
+          <w:u w:val="single"/>
+          <w:outline w:val="1"/>
+        </w:rPr>
+        <w:t>-Apis - Google Maps, Aoi Apis, Weather And Traffic Apis.</w:t>
+      </w:r>
+    </w:p>
+    <w:p>
+      <w:pPr>
+        <w:spacing w:before="0" w:after="160" w:line="480" w:lineRule="auto"/>
+        <w:jc w:val="left"/>
+      </w:pPr>
+    </w:p>
+    <w:p>
+      <w:pPr>
+        <w:spacing w:before="0" w:after="160" w:line="480" w:lineRule="auto"/>
+        <w:jc w:val="left"/>
+      </w:pPr>
+      <w:r>
+        <w:rPr>
+          <w:rFonts w:ascii="Calibri" w:hAnsi="Calibri"/>
+          <w:sz w:val="58"/>
+        </w:rPr>
+        <w:t>• Ai-Powered Missing Person Identification Platform:</w:t>
+      </w:r>
+    </w:p>
+    <w:p>
+      <w:pPr>
+        <w:spacing w:before="0" w:after="160" w:line="480" w:lineRule="auto"/>
+        <w:jc w:val="left"/>
+      </w:pPr>
+      <w:r>
+        <w:rPr>
+          <w:rFonts w:ascii="Calibri" w:hAnsi="Calibri"/>
+          <w:b/>
+          <w:i/>
+          <w:color w:val="FF0000"/>
+          <w:sz w:val="58"/>
+          <w:outline w:val="1"/>
+          <w:u w:val="single"/>
+        </w:rPr>
+        <w:t>-Upload Image, Search Database, Generate Alert,</w:t>
+      </w:r>
+    </w:p>
+    <w:p>
+      <w:pPr>
+        <w:spacing w:before="0" w:after="160" w:line="480" w:lineRule="auto"/>
+        <w:jc w:val="left"/>
+      </w:pPr>
+      <w:r>
+        <w:rPr>
+          <w:rFonts w:ascii="Calibri" w:hAnsi="Calibri"/>
           <w:b w:val="0"/>
           <w:i/>
           <w:color w:val="FF0000"/>
@@ -191,26 +246,27 @@
           <w:u w:val="single"/>
           <w:outline w:val="1"/>
         </w:rPr>
-        <w:t>-Apis - Google Maps, Aoi Apis, Weather And Traffic Apis.</w:t>
-      </w:r>
-    </w:p>
-    <w:p>
-      <w:pPr>
-        <w:spacing w:before="0" w:after="160" w:line="480" w:lineRule="auto"/>
-        <w:jc w:val="left"/>
-      </w:pPr>
-    </w:p>
-    <w:p>
-      <w:pPr>
-        <w:spacing w:before="0" w:after="160" w:line="480" w:lineRule="auto"/>
-        <w:jc w:val="left"/>
-      </w:pPr>
-      <w:r>
-        <w:rPr>
-          <w:rFonts w:ascii="Calibri" w:hAnsi="Calibri"/>
-          <w:sz w:val="58"/>
-        </w:rPr>
-        <w:t>• Ai-Powered Missing Person Identification Platform:</w:t>
+        <w:t>-Use Ready Made Face Recognition Libraries</w:t>
+      </w:r>
+    </w:p>
+    <w:p>
+      <w:pPr>
+        <w:spacing w:before="0" w:after="160" w:line="480" w:lineRule="auto"/>
+        <w:jc w:val="left"/>
+      </w:pPr>
+    </w:p>
+    <w:p>
+      <w:pPr>
+        <w:spacing w:before="0" w:after="160" w:line="480" w:lineRule="auto"/>
+        <w:jc w:val="left"/>
+      </w:pPr>
+      <w:r>
+        <w:rPr>
+          <w:rFonts w:ascii="Calibri" w:hAnsi="Calibri"/>
+          <w:i/>
+          <w:sz w:val="58"/>
+        </w:rPr>
+        <w:t>• Women Safety And Smart Emergency Response System:</w:t>
       </w:r>
     </w:p>
     <w:p>
@@ -228,7 +284,47 @@
           <w:outline w:val="1"/>
           <w:u w:val="single"/>
         </w:rPr>
-        <w:t>-Upload Image, Search Database, Generate Alert,</w:t>
+        <w:t>-Live Location Tracking, Emergency Alert, Nearby Police Station Detection, Safe Route Recommendation</w:t>
+      </w:r>
+    </w:p>
+    <w:p>
+      <w:pPr>
+        <w:spacing w:before="0" w:after="160" w:line="480" w:lineRule="auto"/>
+        <w:jc w:val="left"/>
+      </w:pPr>
+    </w:p>
+    <w:p>
+      <w:pPr>
+        <w:spacing w:before="0" w:after="160" w:line="480" w:lineRule="auto"/>
+        <w:jc w:val="left"/>
+      </w:pPr>
+      <w:r>
+        <w:rPr>
+          <w:rFonts w:ascii="Calibri" w:hAnsi="Calibri"/>
+          <w:sz w:val="58"/>
+          <w:u w:val="single"/>
+        </w:rPr>
+        <w:t>• Ai-Powered Road Damage Reporting:</w:t>
+      </w:r>
+    </w:p>
+    <w:p>
+      <w:pPr>
+        <w:spacing w:before="0" w:after="160" w:line="480" w:lineRule="auto"/>
+        <w:jc w:val="left"/>
+      </w:pPr>
+    </w:p>
+    <w:p>
+      <w:pPr>
+        <w:spacing w:before="0" w:after="160" w:line="480" w:lineRule="auto"/>
+        <w:jc w:val="left"/>
+      </w:pPr>
+      <w:r>
+        <w:rPr>
+          <w:rFonts w:ascii="Calibri" w:hAnsi="Calibri"/>
+          <w:strike/>
+          <w:sz w:val="58"/>
+        </w:rPr>
+        <w:t>• Road Accident Reporting, Emergency Calling:</w:t>
       </w:r>
     </w:p>
     <w:p>
@@ -245,99 +341,8 @@
           <w:sz w:val="58"/>
           <w:u w:val="single"/>
           <w:outline w:val="1"/>
-        </w:rPr>
-        <w:t>-Use Ready Made Face Recognition Libraries</w:t>
-      </w:r>
-    </w:p>
-    <w:p>
-      <w:pPr>
-        <w:spacing w:before="0" w:after="160" w:line="480" w:lineRule="auto"/>
-        <w:jc w:val="left"/>
-      </w:pPr>
-    </w:p>
-    <w:p>
-      <w:pPr>
-        <w:spacing w:before="0" w:after="160" w:line="480" w:lineRule="auto"/>
-        <w:jc w:val="left"/>
-      </w:pPr>
-      <w:r>
-        <w:rPr>
-          <w:rFonts w:ascii="Calibri" w:hAnsi="Calibri"/>
-          <w:sz w:val="58"/>
-        </w:rPr>
-        <w:t>• Women Safety And Smart Emergency Response System:</w:t>
-      </w:r>
-    </w:p>
-    <w:p>
-      <w:pPr>
-        <w:spacing w:before="0" w:after="160" w:line="480" w:lineRule="auto"/>
-        <w:jc w:val="left"/>
-      </w:pPr>
-      <w:r>
-        <w:rPr>
-          <w:rFonts w:ascii="Calibri" w:hAnsi="Calibri"/>
-          <w:b/>
-          <w:i/>
-          <w:color w:val="FF0000"/>
-          <w:sz w:val="58"/>
-          <w:outline w:val="1"/>
-          <w:u w:val="single"/>
-        </w:rPr>
-        <w:t>-Live Location Tracking, Emergency Alert, Nearby Police Station Detection, Safe Route Recommendation</w:t>
-      </w:r>
-    </w:p>
-    <w:p>
-      <w:pPr>
-        <w:spacing w:before="0" w:after="160" w:line="480" w:lineRule="auto"/>
-        <w:jc w:val="left"/>
-      </w:pPr>
-    </w:p>
-    <w:p>
-      <w:pPr>
-        <w:spacing w:before="0" w:after="160" w:line="480" w:lineRule="auto"/>
-        <w:jc w:val="left"/>
-      </w:pPr>
-      <w:r>
-        <w:rPr>
-          <w:rFonts w:ascii="Calibri" w:hAnsi="Calibri"/>
-          <w:sz w:val="58"/>
-        </w:rPr>
-        <w:t>• Ai-Powered Road Damage Reporting:</w:t>
-      </w:r>
-    </w:p>
-    <w:p>
-      <w:pPr>
-        <w:spacing w:before="0" w:after="160" w:line="480" w:lineRule="auto"/>
-        <w:jc w:val="left"/>
-      </w:pPr>
-    </w:p>
-    <w:p>
-      <w:pPr>
-        <w:spacing w:before="0" w:after="160" w:line="480" w:lineRule="auto"/>
-        <w:jc w:val="left"/>
-      </w:pPr>
-      <w:r>
-        <w:rPr>
-          <w:rFonts w:ascii="Calibri" w:hAnsi="Calibri"/>
-          <w:sz w:val="58"/>
-        </w:rPr>
-        <w:t>• Road Accident Reporting, Emergency Calling:</w:t>
-      </w:r>
-    </w:p>
-    <w:p>
-      <w:pPr>
-        <w:spacing w:before="0" w:after="160" w:line="480" w:lineRule="auto"/>
-        <w:jc w:val="left"/>
-      </w:pPr>
-      <w:r>
-        <w:rPr>
-          <w:rFonts w:ascii="Calibri" w:hAnsi="Calibri"/>
-          <w:b w:val="0"/>
-          <w:i/>
-          <w:color w:val="FF0000"/>
-          <w:sz w:val="58"/>
-          <w:u w:val="single"/>
-          <w:outline w:val="1"/>
+          <w:highlight w:val="yellow"/>
+          <w:shd w:val="clear" w:color="auto" w:fill="FFFF00"/>
         </w:rPr>
         <w:t>-Like Police Stations , Ambulance</w:t>
       </w:r>
@@ -393,6 +398,7 @@
     <w:p/>
     <w:p>
       <w:pPr>
+        <w:pStyle w:val="Heading1"/>
         <w:ind w:left="720" w:hanging="360"/>
       </w:pPr>
       <w:r>
@@ -441,6 +447,7 @@
     <w:p>
       <w:pPr>
         <w:ind w:left="720" w:hanging="360"/>
+        <w:jc w:val="center"/>
       </w:pPr>
       <w:r>
         <w:rPr>

</xml_diff>